<commit_message>
Aviso de tempo contradito, falsos positivos ao lado do relatório e frases reescritas
- Aviso quando a narração contradiz o tempo escolhido (metadata.tempo_contradito,
  faixa no topo da lista de alertas); os alertas não mudam.
- Extrair falsos positivos grava falsos-positivos.json na pasta do relatório e
  mostra "Mostrar no Finder"; o painel só aparece se a pasta não aceitar gravação.
- Frases de testes, exemplos, comentários e documentação reescritas com outras
  palavras e contextos; exemplos Editorial e Mestre regenerados pelo FONTE 1.3.1.

Co-Authored-By: Claude Opus 5.5 <noreply@anthropic.com>
</commit_message>
<xml_diff>
--- a/examples/Manuscrito-editorial.docx
+++ b/examples/Manuscrito-editorial.docx
@@ -27,12 +27,12 @@
     </w:p>
     <w:p>
       <w:r>
-        <w:t>Você não treina amanhã nem nos três dias seguintes.</w:t>
+        <w:t>Você não trabalha amanhã nem nos três dias seguintes.</w:t>
       </w:r>
     </w:p>
     <w:p>
       <w:r>
-        <w:t>O jogador está suspenso por três dias.</w:t>
+        <w:t>O técnico está afastado por três dias.</w:t>
       </w:r>
     </w:p>
     <w:p>

</xml_diff>